<commit_message>
Content protection: disable text selection, video no-download controls, robots.txt, resume PDF + read-only protected docx
</commit_message>
<xml_diff>
--- a/public/guangze-resume.docx
+++ b/public/guangze-resume.docx
@@ -56,6 +56,8 @@
             <w:pPr>
               <w:jc w:val="left"/>
             </w:pPr>
+            <w:bookmarkStart w:id="0" w:name="_GoBack"/>
+            <w:bookmarkEnd w:id="0"/>
             <w:r>
               <w:rPr>
                 <w:rFonts w:ascii="微软雅黑" w:hAnsi="微软雅黑" w:eastAsia="微软雅黑"/>
@@ -634,8 +636,6 @@
         </w:rPr>
         <w:t>跟拍摄影师</w:t>
       </w:r>
-      <w:bookmarkStart w:id="0" w:name="_GoBack"/>
-      <w:bookmarkEnd w:id="0"/>
     </w:p>
     <w:p>
       <w:pPr>
@@ -2158,21 +2158,21 @@
     <w:lsdException w:uiPriority="99" w:name="endnote reference"/>
     <w:lsdException w:uiPriority="99" w:name="endnote text"/>
     <w:lsdException w:uiPriority="99" w:name="table of authorities"/>
-    <w:lsdException w:uiPriority="99" w:semiHidden="0" w:name="macro"/>
+    <w:lsdException w:qFormat="1" w:uiPriority="99" w:semiHidden="0" w:name="macro"/>
     <w:lsdException w:uiPriority="99" w:name="toa heading"/>
     <w:lsdException w:qFormat="1" w:uiPriority="99" w:semiHidden="0" w:name="List"/>
-    <w:lsdException w:uiPriority="99" w:semiHidden="0" w:name="List Bullet"/>
-    <w:lsdException w:uiPriority="99" w:semiHidden="0" w:name="List Number"/>
+    <w:lsdException w:qFormat="1" w:uiPriority="99" w:semiHidden="0" w:name="List Bullet"/>
+    <w:lsdException w:qFormat="1" w:uiPriority="99" w:semiHidden="0" w:name="List Number"/>
     <w:lsdException w:qFormat="1" w:uiPriority="99" w:semiHidden="0" w:name="List 2"/>
-    <w:lsdException w:uiPriority="99" w:semiHidden="0" w:name="List 3"/>
+    <w:lsdException w:qFormat="1" w:uiPriority="99" w:semiHidden="0" w:name="List 3"/>
     <w:lsdException w:uiPriority="99" w:name="List 4"/>
     <w:lsdException w:uiPriority="99" w:name="List 5"/>
-    <w:lsdException w:uiPriority="99" w:semiHidden="0" w:name="List Bullet 2"/>
-    <w:lsdException w:uiPriority="99" w:semiHidden="0" w:name="List Bullet 3"/>
+    <w:lsdException w:qFormat="1" w:uiPriority="99" w:semiHidden="0" w:name="List Bullet 2"/>
+    <w:lsdException w:qFormat="1" w:uiPriority="99" w:semiHidden="0" w:name="List Bullet 3"/>
     <w:lsdException w:uiPriority="99" w:name="List Bullet 4"/>
     <w:lsdException w:uiPriority="99" w:name="List Bullet 5"/>
-    <w:lsdException w:uiPriority="99" w:semiHidden="0" w:name="List Number 2"/>
-    <w:lsdException w:uiPriority="99" w:semiHidden="0" w:name="List Number 3"/>
+    <w:lsdException w:qFormat="1" w:uiPriority="99" w:semiHidden="0" w:name="List Number 2"/>
+    <w:lsdException w:qFormat="1" w:uiPriority="99" w:semiHidden="0" w:name="List Number 3"/>
     <w:lsdException w:uiPriority="99" w:name="List Number 4"/>
     <w:lsdException w:uiPriority="99" w:name="List Number 5"/>
     <w:lsdException w:qFormat="1" w:unhideWhenUsed="0" w:uiPriority="10" w:semiHidden="0" w:name="Title"/>
@@ -2183,7 +2183,7 @@
     <w:lsdException w:uiPriority="99" w:name="Body Text Indent"/>
     <w:lsdException w:qFormat="1" w:uiPriority="99" w:semiHidden="0" w:name="List Continue"/>
     <w:lsdException w:qFormat="1" w:uiPriority="99" w:semiHidden="0" w:name="List Continue 2"/>
-    <w:lsdException w:uiPriority="99" w:semiHidden="0" w:name="List Continue 3"/>
+    <w:lsdException w:qFormat="1" w:uiPriority="99" w:semiHidden="0" w:name="List Continue 3"/>
     <w:lsdException w:uiPriority="99" w:name="List Continue 4"/>
     <w:lsdException w:uiPriority="99" w:name="List Continue 5"/>
     <w:lsdException w:uiPriority="99" w:name="Message Header"/>
@@ -2267,13 +2267,13 @@
     <w:lsdException w:qFormat="1" w:unhideWhenUsed="0" w:uiPriority="60" w:semiHidden="0" w:name="Light Shading"/>
     <w:lsdException w:qFormat="1" w:unhideWhenUsed="0" w:uiPriority="61" w:semiHidden="0" w:name="Light List"/>
     <w:lsdException w:qFormat="1" w:unhideWhenUsed="0" w:uiPriority="62" w:semiHidden="0" w:name="Light Grid"/>
-    <w:lsdException w:unhideWhenUsed="0" w:uiPriority="63" w:semiHidden="0" w:name="Medium Shading 1"/>
+    <w:lsdException w:qFormat="1" w:unhideWhenUsed="0" w:uiPriority="63" w:semiHidden="0" w:name="Medium Shading 1"/>
     <w:lsdException w:qFormat="1" w:unhideWhenUsed="0" w:uiPriority="64" w:semiHidden="0" w:name="Medium Shading 2"/>
     <w:lsdException w:qFormat="1" w:unhideWhenUsed="0" w:uiPriority="65" w:semiHidden="0" w:name="Medium List 1"/>
     <w:lsdException w:qFormat="1" w:unhideWhenUsed="0" w:uiPriority="66" w:semiHidden="0" w:name="Medium List 2"/>
-    <w:lsdException w:unhideWhenUsed="0" w:uiPriority="67" w:semiHidden="0" w:name="Medium Grid 1"/>
-    <w:lsdException w:unhideWhenUsed="0" w:uiPriority="68" w:semiHidden="0" w:name="Medium Grid 2"/>
-    <w:lsdException w:unhideWhenUsed="0" w:uiPriority="69" w:semiHidden="0" w:name="Medium Grid 3"/>
+    <w:lsdException w:qFormat="1" w:unhideWhenUsed="0" w:uiPriority="67" w:semiHidden="0" w:name="Medium Grid 1"/>
+    <w:lsdException w:qFormat="1" w:unhideWhenUsed="0" w:uiPriority="68" w:semiHidden="0" w:name="Medium Grid 2"/>
+    <w:lsdException w:qFormat="1" w:unhideWhenUsed="0" w:uiPriority="69" w:semiHidden="0" w:name="Medium Grid 3"/>
     <w:lsdException w:qFormat="1" w:unhideWhenUsed="0" w:uiPriority="70" w:semiHidden="0" w:name="Dark List"/>
     <w:lsdException w:qFormat="1" w:unhideWhenUsed="0" w:uiPriority="71" w:semiHidden="0" w:name="Colorful Shading"/>
     <w:lsdException w:qFormat="1" w:unhideWhenUsed="0" w:uiPriority="72" w:semiHidden="0" w:name="Colorful List"/>
@@ -2282,15 +2282,15 @@
     <w:lsdException w:qFormat="1" w:unhideWhenUsed="0" w:uiPriority="61" w:semiHidden="0" w:name="Light List Accent 1"/>
     <w:lsdException w:qFormat="1" w:unhideWhenUsed="0" w:uiPriority="62" w:semiHidden="0" w:name="Light Grid Accent 1"/>
     <w:lsdException w:qFormat="1" w:unhideWhenUsed="0" w:uiPriority="63" w:semiHidden="0" w:name="Medium Shading 1 Accent 1"/>
-    <w:lsdException w:unhideWhenUsed="0" w:uiPriority="64" w:semiHidden="0" w:name="Medium Shading 2 Accent 1"/>
+    <w:lsdException w:qFormat="1" w:unhideWhenUsed="0" w:uiPriority="64" w:semiHidden="0" w:name="Medium Shading 2 Accent 1"/>
     <w:lsdException w:qFormat="1" w:unhideWhenUsed="0" w:uiPriority="65" w:semiHidden="0" w:name="Medium List 1 Accent 1"/>
     <w:lsdException w:qFormat="1" w:unhideWhenUsed="0" w:uiPriority="34" w:semiHidden="0" w:name="List Paragraph"/>
     <w:lsdException w:qFormat="1" w:unhideWhenUsed="0" w:uiPriority="29" w:semiHidden="0" w:name="Quote"/>
     <w:lsdException w:qFormat="1" w:unhideWhenUsed="0" w:uiPriority="30" w:semiHidden="0" w:name="Intense Quote"/>
     <w:lsdException w:qFormat="1" w:unhideWhenUsed="0" w:uiPriority="66" w:semiHidden="0" w:name="Medium List 2 Accent 1"/>
-    <w:lsdException w:unhideWhenUsed="0" w:uiPriority="67" w:semiHidden="0" w:name="Medium Grid 1 Accent 1"/>
-    <w:lsdException w:unhideWhenUsed="0" w:uiPriority="68" w:semiHidden="0" w:name="Medium Grid 2 Accent 1"/>
-    <w:lsdException w:unhideWhenUsed="0" w:uiPriority="69" w:semiHidden="0" w:name="Medium Grid 3 Accent 1"/>
+    <w:lsdException w:qFormat="1" w:unhideWhenUsed="0" w:uiPriority="67" w:semiHidden="0" w:name="Medium Grid 1 Accent 1"/>
+    <w:lsdException w:qFormat="1" w:unhideWhenUsed="0" w:uiPriority="68" w:semiHidden="0" w:name="Medium Grid 2 Accent 1"/>
+    <w:lsdException w:qFormat="1" w:unhideWhenUsed="0" w:uiPriority="69" w:semiHidden="0" w:name="Medium Grid 3 Accent 1"/>
     <w:lsdException w:qFormat="1" w:unhideWhenUsed="0" w:uiPriority="70" w:semiHidden="0" w:name="Dark List Accent 1"/>
     <w:lsdException w:qFormat="1" w:unhideWhenUsed="0" w:uiPriority="71" w:semiHidden="0" w:name="Colorful Shading Accent 1"/>
     <w:lsdException w:qFormat="1" w:unhideWhenUsed="0" w:uiPriority="72" w:semiHidden="0" w:name="Colorful List Accent 1"/>
@@ -2302,23 +2302,23 @@
     <w:lsdException w:qFormat="1" w:unhideWhenUsed="0" w:uiPriority="64" w:semiHidden="0" w:name="Medium Shading 2 Accent 2"/>
     <w:lsdException w:qFormat="1" w:unhideWhenUsed="0" w:uiPriority="65" w:semiHidden="0" w:name="Medium List 1 Accent 2"/>
     <w:lsdException w:qFormat="1" w:unhideWhenUsed="0" w:uiPriority="66" w:semiHidden="0" w:name="Medium List 2 Accent 2"/>
-    <w:lsdException w:unhideWhenUsed="0" w:uiPriority="67" w:semiHidden="0" w:name="Medium Grid 1 Accent 2"/>
-    <w:lsdException w:unhideWhenUsed="0" w:uiPriority="68" w:semiHidden="0" w:name="Medium Grid 2 Accent 2"/>
-    <w:lsdException w:unhideWhenUsed="0" w:uiPriority="69" w:semiHidden="0" w:name="Medium Grid 3 Accent 2"/>
+    <w:lsdException w:qFormat="1" w:unhideWhenUsed="0" w:uiPriority="67" w:semiHidden="0" w:name="Medium Grid 1 Accent 2"/>
+    <w:lsdException w:qFormat="1" w:unhideWhenUsed="0" w:uiPriority="68" w:semiHidden="0" w:name="Medium Grid 2 Accent 2"/>
+    <w:lsdException w:qFormat="1" w:unhideWhenUsed="0" w:uiPriority="69" w:semiHidden="0" w:name="Medium Grid 3 Accent 2"/>
     <w:lsdException w:qFormat="1" w:unhideWhenUsed="0" w:uiPriority="70" w:semiHidden="0" w:name="Dark List Accent 2"/>
     <w:lsdException w:qFormat="1" w:unhideWhenUsed="0" w:uiPriority="71" w:semiHidden="0" w:name="Colorful Shading Accent 2"/>
     <w:lsdException w:qFormat="1" w:unhideWhenUsed="0" w:uiPriority="72" w:semiHidden="0" w:name="Colorful List Accent 2"/>
     <w:lsdException w:qFormat="1" w:unhideWhenUsed="0" w:uiPriority="73" w:semiHidden="0" w:name="Colorful Grid Accent 2"/>
-    <w:lsdException w:unhideWhenUsed="0" w:uiPriority="60" w:semiHidden="0" w:name="Light Shading Accent 3"/>
+    <w:lsdException w:qFormat="1" w:unhideWhenUsed="0" w:uiPriority="60" w:semiHidden="0" w:name="Light Shading Accent 3"/>
     <w:lsdException w:qFormat="1" w:unhideWhenUsed="0" w:uiPriority="61" w:semiHidden="0" w:name="Light List Accent 3"/>
     <w:lsdException w:qFormat="1" w:unhideWhenUsed="0" w:uiPriority="62" w:semiHidden="0" w:name="Light Grid Accent 3"/>
     <w:lsdException w:qFormat="1" w:unhideWhenUsed="0" w:uiPriority="63" w:semiHidden="0" w:name="Medium Shading 1 Accent 3"/>
     <w:lsdException w:qFormat="1" w:unhideWhenUsed="0" w:uiPriority="64" w:semiHidden="0" w:name="Medium Shading 2 Accent 3"/>
     <w:lsdException w:qFormat="1" w:unhideWhenUsed="0" w:uiPriority="65" w:semiHidden="0" w:name="Medium List 1 Accent 3"/>
     <w:lsdException w:qFormat="1" w:unhideWhenUsed="0" w:uiPriority="66" w:semiHidden="0" w:name="Medium List 2 Accent 3"/>
-    <w:lsdException w:unhideWhenUsed="0" w:uiPriority="67" w:semiHidden="0" w:name="Medium Grid 1 Accent 3"/>
-    <w:lsdException w:unhideWhenUsed="0" w:uiPriority="68" w:semiHidden="0" w:name="Medium Grid 2 Accent 3"/>
-    <w:lsdException w:unhideWhenUsed="0" w:uiPriority="69" w:semiHidden="0" w:name="Medium Grid 3 Accent 3"/>
+    <w:lsdException w:qFormat="1" w:unhideWhenUsed="0" w:uiPriority="67" w:semiHidden="0" w:name="Medium Grid 1 Accent 3"/>
+    <w:lsdException w:qFormat="1" w:unhideWhenUsed="0" w:uiPriority="68" w:semiHidden="0" w:name="Medium Grid 2 Accent 3"/>
+    <w:lsdException w:qFormat="1" w:unhideWhenUsed="0" w:uiPriority="69" w:semiHidden="0" w:name="Medium Grid 3 Accent 3"/>
     <w:lsdException w:qFormat="1" w:unhideWhenUsed="0" w:uiPriority="70" w:semiHidden="0" w:name="Dark List Accent 3"/>
     <w:lsdException w:qFormat="1" w:unhideWhenUsed="0" w:uiPriority="71" w:semiHidden="0" w:name="Colorful Shading Accent 3"/>
     <w:lsdException w:qFormat="1" w:unhideWhenUsed="0" w:uiPriority="72" w:semiHidden="0" w:name="Colorful List Accent 3"/>
@@ -2327,26 +2327,26 @@
     <w:lsdException w:qFormat="1" w:unhideWhenUsed="0" w:uiPriority="61" w:semiHidden="0" w:name="Light List Accent 4"/>
     <w:lsdException w:qFormat="1" w:unhideWhenUsed="0" w:uiPriority="62" w:semiHidden="0" w:name="Light Grid Accent 4"/>
     <w:lsdException w:qFormat="1" w:unhideWhenUsed="0" w:uiPriority="63" w:semiHidden="0" w:name="Medium Shading 1 Accent 4"/>
-    <w:lsdException w:unhideWhenUsed="0" w:uiPriority="64" w:semiHidden="0" w:name="Medium Shading 2 Accent 4"/>
+    <w:lsdException w:qFormat="1" w:unhideWhenUsed="0" w:uiPriority="64" w:semiHidden="0" w:name="Medium Shading 2 Accent 4"/>
     <w:lsdException w:qFormat="1" w:unhideWhenUsed="0" w:uiPriority="65" w:semiHidden="0" w:name="Medium List 1 Accent 4"/>
     <w:lsdException w:qFormat="1" w:unhideWhenUsed="0" w:uiPriority="66" w:semiHidden="0" w:name="Medium List 2 Accent 4"/>
-    <w:lsdException w:unhideWhenUsed="0" w:uiPriority="67" w:semiHidden="0" w:name="Medium Grid 1 Accent 4"/>
-    <w:lsdException w:unhideWhenUsed="0" w:uiPriority="68" w:semiHidden="0" w:name="Medium Grid 2 Accent 4"/>
-    <w:lsdException w:unhideWhenUsed="0" w:uiPriority="69" w:semiHidden="0" w:name="Medium Grid 3 Accent 4"/>
+    <w:lsdException w:qFormat="1" w:unhideWhenUsed="0" w:uiPriority="67" w:semiHidden="0" w:name="Medium Grid 1 Accent 4"/>
+    <w:lsdException w:qFormat="1" w:unhideWhenUsed="0" w:uiPriority="68" w:semiHidden="0" w:name="Medium Grid 2 Accent 4"/>
+    <w:lsdException w:qFormat="1" w:unhideWhenUsed="0" w:uiPriority="69" w:semiHidden="0" w:name="Medium Grid 3 Accent 4"/>
     <w:lsdException w:qFormat="1" w:unhideWhenUsed="0" w:uiPriority="70" w:semiHidden="0" w:name="Dark List Accent 4"/>
     <w:lsdException w:qFormat="1" w:unhideWhenUsed="0" w:uiPriority="71" w:semiHidden="0" w:name="Colorful Shading Accent 4"/>
     <w:lsdException w:qFormat="1" w:unhideWhenUsed="0" w:uiPriority="72" w:semiHidden="0" w:name="Colorful List Accent 4"/>
     <w:lsdException w:qFormat="1" w:unhideWhenUsed="0" w:uiPriority="73" w:semiHidden="0" w:name="Colorful Grid Accent 4"/>
     <w:lsdException w:qFormat="1" w:unhideWhenUsed="0" w:uiPriority="60" w:semiHidden="0" w:name="Light Shading Accent 5"/>
-    <w:lsdException w:unhideWhenUsed="0" w:uiPriority="61" w:semiHidden="0" w:name="Light List Accent 5"/>
+    <w:lsdException w:qFormat="1" w:unhideWhenUsed="0" w:uiPriority="61" w:semiHidden="0" w:name="Light List Accent 5"/>
     <w:lsdException w:qFormat="1" w:unhideWhenUsed="0" w:uiPriority="62" w:semiHidden="0" w:name="Light Grid Accent 5"/>
     <w:lsdException w:qFormat="1" w:unhideWhenUsed="0" w:uiPriority="63" w:semiHidden="0" w:name="Medium Shading 1 Accent 5"/>
-    <w:lsdException w:unhideWhenUsed="0" w:uiPriority="64" w:semiHidden="0" w:name="Medium Shading 2 Accent 5"/>
+    <w:lsdException w:qFormat="1" w:unhideWhenUsed="0" w:uiPriority="64" w:semiHidden="0" w:name="Medium Shading 2 Accent 5"/>
     <w:lsdException w:qFormat="1" w:unhideWhenUsed="0" w:uiPriority="65" w:semiHidden="0" w:name="Medium List 1 Accent 5"/>
     <w:lsdException w:qFormat="1" w:unhideWhenUsed="0" w:uiPriority="66" w:semiHidden="0" w:name="Medium List 2 Accent 5"/>
-    <w:lsdException w:unhideWhenUsed="0" w:uiPriority="67" w:semiHidden="0" w:name="Medium Grid 1 Accent 5"/>
-    <w:lsdException w:unhideWhenUsed="0" w:uiPriority="68" w:semiHidden="0" w:name="Medium Grid 2 Accent 5"/>
-    <w:lsdException w:unhideWhenUsed="0" w:uiPriority="69" w:semiHidden="0" w:name="Medium Grid 3 Accent 5"/>
+    <w:lsdException w:qFormat="1" w:unhideWhenUsed="0" w:uiPriority="67" w:semiHidden="0" w:name="Medium Grid 1 Accent 5"/>
+    <w:lsdException w:qFormat="1" w:unhideWhenUsed="0" w:uiPriority="68" w:semiHidden="0" w:name="Medium Grid 2 Accent 5"/>
+    <w:lsdException w:qFormat="1" w:unhideWhenUsed="0" w:uiPriority="69" w:semiHidden="0" w:name="Medium Grid 3 Accent 5"/>
     <w:lsdException w:qFormat="1" w:unhideWhenUsed="0" w:uiPriority="70" w:semiHidden="0" w:name="Dark List Accent 5"/>
     <w:lsdException w:qFormat="1" w:unhideWhenUsed="0" w:uiPriority="71" w:semiHidden="0" w:name="Colorful Shading Accent 5"/>
     <w:lsdException w:qFormat="1" w:unhideWhenUsed="0" w:uiPriority="72" w:semiHidden="0" w:name="Colorful List Accent 5"/>
@@ -2358,8 +2358,8 @@
     <w:lsdException w:qFormat="1" w:unhideWhenUsed="0" w:uiPriority="64" w:semiHidden="0" w:name="Medium Shading 2 Accent 6"/>
     <w:lsdException w:qFormat="1" w:unhideWhenUsed="0" w:uiPriority="65" w:semiHidden="0" w:name="Medium List 1 Accent 6"/>
     <w:lsdException w:qFormat="1" w:unhideWhenUsed="0" w:uiPriority="66" w:semiHidden="0" w:name="Medium List 2 Accent 6"/>
-    <w:lsdException w:unhideWhenUsed="0" w:uiPriority="67" w:semiHidden="0" w:name="Medium Grid 1 Accent 6"/>
-    <w:lsdException w:unhideWhenUsed="0" w:uiPriority="68" w:semiHidden="0" w:name="Medium Grid 2 Accent 6"/>
+    <w:lsdException w:qFormat="1" w:unhideWhenUsed="0" w:uiPriority="67" w:semiHidden="0" w:name="Medium Grid 1 Accent 6"/>
+    <w:lsdException w:qFormat="1" w:unhideWhenUsed="0" w:uiPriority="68" w:semiHidden="0" w:name="Medium Grid 2 Accent 6"/>
     <w:lsdException w:qFormat="1" w:unhideWhenUsed="0" w:uiPriority="69" w:semiHidden="0" w:name="Medium Grid 3 Accent 6"/>
     <w:lsdException w:qFormat="1" w:unhideWhenUsed="0" w:uiPriority="70" w:semiHidden="0" w:name="Dark List Accent 6"/>
     <w:lsdException w:qFormat="1" w:unhideWhenUsed="0" w:uiPriority="71" w:semiHidden="0" w:name="Colorful Shading Accent 6"/>
@@ -2638,6 +2638,7 @@
     <w:name w:val="macro"/>
     <w:link w:val="147"/>
     <w:unhideWhenUsed/>
+    <w:qFormat/>
     <w:uiPriority w:val="99"/>
     <w:pPr>
       <w:tabs>
@@ -2662,6 +2663,7 @@
     <w:name w:val="List 3"/>
     <w:basedOn w:val="1"/>
     <w:unhideWhenUsed/>
+    <w:qFormat/>
     <w:uiPriority w:val="99"/>
     <w:pPr>
       <w:ind w:left="1080" w:hanging="360"/>
@@ -2672,6 +2674,7 @@
     <w:name w:val="List Number 2"/>
     <w:basedOn w:val="1"/>
     <w:unhideWhenUsed/>
+    <w:qFormat/>
     <w:uiPriority w:val="99"/>
     <w:pPr>
       <w:numPr>
@@ -2685,6 +2688,7 @@
     <w:name w:val="List Number"/>
     <w:basedOn w:val="1"/>
     <w:unhideWhenUsed/>
+    <w:qFormat/>
     <w:uiPriority w:val="99"/>
     <w:pPr>
       <w:numPr>
@@ -2722,6 +2726,7 @@
     <w:name w:val="List Bullet"/>
     <w:basedOn w:val="1"/>
     <w:unhideWhenUsed/>
+    <w:qFormat/>
     <w:uiPriority w:val="99"/>
     <w:pPr>
       <w:numPr>
@@ -2750,6 +2755,7 @@
     <w:name w:val="List Bullet 3"/>
     <w:basedOn w:val="1"/>
     <w:unhideWhenUsed/>
+    <w:qFormat/>
     <w:uiPriority w:val="99"/>
     <w:pPr>
       <w:numPr>
@@ -2774,6 +2780,7 @@
     <w:name w:val="List Number 3"/>
     <w:basedOn w:val="1"/>
     <w:unhideWhenUsed/>
+    <w:qFormat/>
     <w:uiPriority w:val="99"/>
     <w:pPr>
       <w:numPr>
@@ -2810,6 +2817,7 @@
     <w:name w:val="List Bullet 2"/>
     <w:basedOn w:val="1"/>
     <w:unhideWhenUsed/>
+    <w:qFormat/>
     <w:uiPriority w:val="99"/>
     <w:pPr>
       <w:numPr>
@@ -2909,6 +2917,7 @@
     <w:name w:val="List Continue 3"/>
     <w:basedOn w:val="1"/>
     <w:unhideWhenUsed/>
+    <w:qFormat/>
     <w:uiPriority w:val="99"/>
     <w:pPr>
       <w:spacing w:after="120"/>
@@ -3267,6 +3276,7 @@
   <w:style w:type="table" w:styleId="37">
     <w:name w:val="Light Shading Accent 3"/>
     <w:basedOn w:val="32"/>
+    <w:qFormat/>
     <w:uiPriority w:val="60"/>
     <w:pPr>
       <w:spacing w:after="0" w:line="240" w:lineRule="auto"/>
@@ -4136,6 +4146,7 @@
   <w:style w:type="table" w:styleId="46">
     <w:name w:val="Light List Accent 5"/>
     <w:basedOn w:val="32"/>
+    <w:qFormat/>
     <w:uiPriority w:val="61"/>
     <w:pPr>
       <w:spacing w:after="0" w:line="240" w:lineRule="auto"/>
@@ -5212,6 +5223,7 @@
   <w:style w:type="table" w:styleId="55">
     <w:name w:val="Medium Shading 1"/>
     <w:basedOn w:val="32"/>
+    <w:qFormat/>
     <w:uiPriority w:val="63"/>
     <w:pPr>
       <w:spacing w:after="0" w:line="240" w:lineRule="auto"/>
@@ -6133,6 +6145,7 @@
   <w:style w:type="table" w:styleId="63">
     <w:name w:val="Medium Shading 2 Accent 1"/>
     <w:basedOn w:val="32"/>
+    <w:qFormat/>
     <w:uiPriority w:val="64"/>
     <w:pPr>
       <w:spacing w:after="0" w:line="240" w:lineRule="auto"/>
@@ -6630,6 +6643,7 @@
   <w:style w:type="table" w:styleId="66">
     <w:name w:val="Medium Shading 2 Accent 4"/>
     <w:basedOn w:val="32"/>
+    <w:qFormat/>
     <w:uiPriority w:val="64"/>
     <w:pPr>
       <w:spacing w:after="0" w:line="240" w:lineRule="auto"/>
@@ -6795,6 +6809,7 @@
   <w:style w:type="table" w:styleId="67">
     <w:name w:val="Medium Shading 2 Accent 5"/>
     <w:basedOn w:val="32"/>
+    <w:qFormat/>
     <w:uiPriority w:val="64"/>
     <w:pPr>
       <w:spacing w:after="0" w:line="240" w:lineRule="auto"/>
@@ -8673,6 +8688,7 @@
   <w:style w:type="table" w:styleId="83">
     <w:name w:val="Medium Grid 1"/>
     <w:basedOn w:val="32"/>
+    <w:qFormat/>
     <w:uiPriority w:val="67"/>
     <w:pPr>
       <w:spacing w:after="0" w:line="240" w:lineRule="auto"/>
@@ -8742,6 +8758,7 @@
   <w:style w:type="table" w:styleId="84">
     <w:name w:val="Medium Grid 1 Accent 1"/>
     <w:basedOn w:val="32"/>
+    <w:qFormat/>
     <w:uiPriority w:val="67"/>
     <w:pPr>
       <w:spacing w:after="0" w:line="240" w:lineRule="auto"/>
@@ -8811,6 +8828,7 @@
   <w:style w:type="table" w:styleId="85">
     <w:name w:val="Medium Grid 1 Accent 2"/>
     <w:basedOn w:val="32"/>
+    <w:qFormat/>
     <w:uiPriority w:val="67"/>
     <w:pPr>
       <w:spacing w:after="0" w:line="240" w:lineRule="auto"/>
@@ -8880,6 +8898,7 @@
   <w:style w:type="table" w:styleId="86">
     <w:name w:val="Medium Grid 1 Accent 3"/>
     <w:basedOn w:val="32"/>
+    <w:qFormat/>
     <w:uiPriority w:val="67"/>
     <w:pPr>
       <w:spacing w:after="0" w:line="240" w:lineRule="auto"/>
@@ -8949,6 +8968,7 @@
   <w:style w:type="table" w:styleId="87">
     <w:name w:val="Medium Grid 1 Accent 4"/>
     <w:basedOn w:val="32"/>
+    <w:qFormat/>
     <w:uiPriority w:val="67"/>
     <w:pPr>
       <w:spacing w:after="0" w:line="240" w:lineRule="auto"/>
@@ -9018,6 +9038,7 @@
   <w:style w:type="table" w:styleId="88">
     <w:name w:val="Medium Grid 1 Accent 5"/>
     <w:basedOn w:val="32"/>
+    <w:qFormat/>
     <w:uiPriority w:val="67"/>
     <w:pPr>
       <w:spacing w:after="0" w:line="240" w:lineRule="auto"/>
@@ -9087,6 +9108,7 @@
   <w:style w:type="table" w:styleId="89">
     <w:name w:val="Medium Grid 1 Accent 6"/>
     <w:basedOn w:val="32"/>
+    <w:qFormat/>
     <w:uiPriority w:val="67"/>
     <w:pPr>
       <w:spacing w:after="0" w:line="240" w:lineRule="auto"/>
@@ -9156,6 +9178,7 @@
   <w:style w:type="table" w:styleId="90">
     <w:name w:val="Medium Grid 2"/>
     <w:basedOn w:val="32"/>
+    <w:qFormat/>
     <w:uiPriority w:val="68"/>
     <w:pPr>
       <w:spacing w:after="0" w:line="240" w:lineRule="auto"/>
@@ -9302,6 +9325,7 @@
   <w:style w:type="table" w:styleId="91">
     <w:name w:val="Medium Grid 2 Accent 1"/>
     <w:basedOn w:val="32"/>
+    <w:qFormat/>
     <w:uiPriority w:val="68"/>
     <w:pPr>
       <w:spacing w:after="0" w:line="240" w:lineRule="auto"/>
@@ -9448,6 +9472,7 @@
   <w:style w:type="table" w:styleId="92">
     <w:name w:val="Medium Grid 2 Accent 2"/>
     <w:basedOn w:val="32"/>
+    <w:qFormat/>
     <w:uiPriority w:val="68"/>
     <w:pPr>
       <w:spacing w:after="0" w:line="240" w:lineRule="auto"/>
@@ -9594,6 +9619,7 @@
   <w:style w:type="table" w:styleId="93">
     <w:name w:val="Medium Grid 2 Accent 3"/>
     <w:basedOn w:val="32"/>
+    <w:qFormat/>
     <w:uiPriority w:val="68"/>
     <w:pPr>
       <w:spacing w:after="0" w:line="240" w:lineRule="auto"/>
@@ -9740,6 +9766,7 @@
   <w:style w:type="table" w:styleId="94">
     <w:name w:val="Medium Grid 2 Accent 4"/>
     <w:basedOn w:val="32"/>
+    <w:qFormat/>
     <w:uiPriority w:val="68"/>
     <w:pPr>
       <w:spacing w:after="0" w:line="240" w:lineRule="auto"/>
@@ -9886,6 +9913,7 @@
   <w:style w:type="table" w:styleId="95">
     <w:name w:val="Medium Grid 2 Accent 5"/>
     <w:basedOn w:val="32"/>
+    <w:qFormat/>
     <w:uiPriority w:val="68"/>
     <w:pPr>
       <w:spacing w:after="0" w:line="240" w:lineRule="auto"/>
@@ -10032,6 +10060,7 @@
   <w:style w:type="table" w:styleId="96">
     <w:name w:val="Medium Grid 2 Accent 6"/>
     <w:basedOn w:val="32"/>
+    <w:qFormat/>
     <w:uiPriority w:val="68"/>
     <w:pPr>
       <w:spacing w:after="0" w:line="240" w:lineRule="auto"/>
@@ -10178,6 +10207,7 @@
   <w:style w:type="table" w:styleId="97">
     <w:name w:val="Medium Grid 3"/>
     <w:basedOn w:val="32"/>
+    <w:qFormat/>
     <w:uiPriority w:val="69"/>
     <w:pPr>
       <w:spacing w:after="0" w:line="240" w:lineRule="auto"/>
@@ -10335,6 +10365,7 @@
   <w:style w:type="table" w:styleId="98">
     <w:name w:val="Medium Grid 3 Accent 1"/>
     <w:basedOn w:val="32"/>
+    <w:qFormat/>
     <w:uiPriority w:val="69"/>
     <w:pPr>
       <w:spacing w:after="0" w:line="240" w:lineRule="auto"/>
@@ -10492,6 +10523,7 @@
   <w:style w:type="table" w:styleId="99">
     <w:name w:val="Medium Grid 3 Accent 2"/>
     <w:basedOn w:val="32"/>
+    <w:qFormat/>
     <w:uiPriority w:val="69"/>
     <w:pPr>
       <w:spacing w:after="0" w:line="240" w:lineRule="auto"/>
@@ -10649,6 +10681,7 @@
   <w:style w:type="table" w:styleId="100">
     <w:name w:val="Medium Grid 3 Accent 3"/>
     <w:basedOn w:val="32"/>
+    <w:qFormat/>
     <w:uiPriority w:val="69"/>
     <w:pPr>
       <w:spacing w:after="0" w:line="240" w:lineRule="auto"/>
@@ -10806,6 +10839,7 @@
   <w:style w:type="table" w:styleId="101">
     <w:name w:val="Medium Grid 3 Accent 4"/>
     <w:basedOn w:val="32"/>
+    <w:qFormat/>
     <w:uiPriority w:val="69"/>
     <w:pPr>
       <w:spacing w:after="0" w:line="240" w:lineRule="auto"/>
@@ -10963,6 +10997,7 @@
   <w:style w:type="table" w:styleId="102">
     <w:name w:val="Medium Grid 3 Accent 5"/>
     <w:basedOn w:val="32"/>
+    <w:qFormat/>
     <w:uiPriority w:val="69"/>
     <w:pPr>
       <w:spacing w:after="0" w:line="240" w:lineRule="auto"/>

</xml_diff>